<commit_message>
fix datetime and add customerprice
</commit_message>
<xml_diff>
--- a/docs/production-manager-app-eng.docx
+++ b/docs/production-manager-app-eng.docx
@@ -4623,8 +4623,8 @@
       <w:bookmarkStart w:id="12" w:name="_Toc371596370"/>
       <w:bookmarkStart w:id="13" w:name="_Toc437263091"/>
       <w:bookmarkStart w:id="14" w:name="_Toc437856796"/>
-      <w:bookmarkStart w:id="15" w:name="_Hlk33037184"/>
-      <w:bookmarkStart w:id="16" w:name="_Toc96272188"/>
+      <w:bookmarkStart w:id="15" w:name="_Toc96272188"/>
+      <w:bookmarkStart w:id="16" w:name="_Hlk33037184"/>
       <w:r>
         <w:lastRenderedPageBreak/>
         <w:t>Annex</w:t>
@@ -4645,14 +4645,68 @@
         </w:rPr>
         <w:t>DB Model</w:t>
       </w:r>
+      <w:bookmarkEnd w:id="15"/>
+      <w:r>
+        <w:rPr>
+          <w:lang w:val="nb-NO"/>
+        </w:rPr>
+        <w:t xml:space="preserve"> </w:t>
+      </w:r>
       <w:bookmarkEnd w:id="16"/>
       <w:r>
         <w:rPr>
           <w:lang w:val="nb-NO"/>
         </w:rPr>
+        <w:t>(</w:t>
+      </w:r>
+      <w:proofErr w:type="spellStart"/>
+      <w:r>
+        <w:rPr>
+          <w:color w:val="FF0000"/>
+          <w:lang w:val="nb-NO"/>
+        </w:rPr>
+        <w:t>fix</w:t>
+      </w:r>
+      <w:proofErr w:type="spellEnd"/>
+      <w:r>
+        <w:rPr>
+          <w:color w:val="FF0000"/>
+          <w:lang w:val="nb-NO"/>
+        </w:rPr>
         <w:t xml:space="preserve"> </w:t>
       </w:r>
-      <w:bookmarkEnd w:id="15"/>
+      <w:proofErr w:type="spellStart"/>
+      <w:r>
+        <w:rPr>
+          <w:color w:val="FF0000"/>
+          <w:lang w:val="nb-NO"/>
+        </w:rPr>
+        <w:t>CustomerPrice</w:t>
+      </w:r>
+      <w:proofErr w:type="spellEnd"/>
+      <w:r>
+        <w:rPr>
+          <w:color w:val="FF0000"/>
+          <w:lang w:val="nb-NO"/>
+        </w:rPr>
+        <w:t xml:space="preserve"> </w:t>
+      </w:r>
+      <w:proofErr w:type="spellStart"/>
+      <w:r>
+        <w:rPr>
+          <w:color w:val="FF0000"/>
+          <w:lang w:val="nb-NO"/>
+        </w:rPr>
+        <w:t>Entity</w:t>
+      </w:r>
+      <w:proofErr w:type="spellEnd"/>
+      <w:r>
+        <w:rPr>
+          <w:color w:val="FF0000"/>
+          <w:lang w:val="nb-NO"/>
+        </w:rPr>
+        <w:t>)</w:t>
+      </w:r>
     </w:p>
     <w:p>
       <w:pPr>

</xml_diff>